<commit_message>
feat(pinterest): asegurar generacion local de pines y pausar publicador api temporalmente
</commit_message>
<xml_diff>
--- a/amazon afiliados.docx
+++ b/amazon afiliados.docx
@@ -56,18 +56,12 @@
     </w:p>
     <w:p/>
     <w:p>
-      <w:pPr>
-        <w:rPr>
-          <w:lang w:val="en-US"/>
-        </w:rPr>
-      </w:pPr>
       <w:r>
         <w:rPr>
           <w:b/>
           <w:sz w:val="40"/>
           <w:szCs w:val="40"/>
           <w:u w:val="single"/>
-          <w:lang w:val="en-US"/>
         </w:rPr>
         <w:t>CLOUD INFRASTRUCTURE:</w:t>
       </w:r>
@@ -77,91 +71,126 @@
           <w:sz w:val="40"/>
           <w:szCs w:val="40"/>
           <w:u w:val="single"/>
-          <w:lang w:val="en-US"/>
         </w:rPr>
         <w:br/>
       </w:r>
       <w:proofErr w:type="spellStart"/>
       <w:r>
-        <w:rPr>
-          <w:lang w:val="en-US"/>
-        </w:rPr>
         <w:t>pagina</w:t>
       </w:r>
       <w:proofErr w:type="spellEnd"/>
       <w:r>
-        <w:rPr>
-          <w:lang w:val="en-US"/>
-        </w:rPr>
         <w:t xml:space="preserve"> web:</w:t>
       </w:r>
-      <w:bookmarkStart w:id="0" w:name="_GoBack"/>
-      <w:bookmarkEnd w:id="0"/>
-    </w:p>
-    <w:p>
-      <w:pPr>
-        <w:rPr>
-          <w:lang w:val="en-US"/>
-        </w:rPr>
-      </w:pPr>
+    </w:p>
+    <w:p>
       <w:hyperlink r:id="rId6" w:history="1">
         <w:r>
           <w:rPr>
             <w:rStyle w:val="Hipervnculo"/>
-            <w:lang w:val="en-US"/>
           </w:rPr>
           <w:t>https://www.oracle.com/cloud/sign-in.html?redirect_uri=https%3A%2F%2Fcloud.oracle.com%2F</w:t>
         </w:r>
       </w:hyperlink>
     </w:p>
-    <w:p>
-      <w:pPr>
-        <w:rPr>
-          <w:lang w:val="en-US"/>
-        </w:rPr>
-      </w:pPr>
-    </w:p>
-    <w:p>
-      <w:pPr>
-        <w:rPr>
-          <w:lang w:val="en-US"/>
-        </w:rPr>
-      </w:pPr>
+    <w:p/>
+    <w:p>
       <w:hyperlink r:id="rId7" w:history="1">
         <w:r>
           <w:rPr>
             <w:rStyle w:val="Hipervnculo"/>
-            <w:lang w:val="en-US"/>
           </w:rPr>
           <w:t>celakantor@gmail.com</w:t>
         </w:r>
       </w:hyperlink>
     </w:p>
     <w:p>
+      <w:r>
+        <w:t>Josejuviles1@</w:t>
+      </w:r>
+    </w:p>
+    <w:p>
       <w:pPr>
         <w:rPr>
-          <w:lang w:val="en-US"/>
+          <w:b/>
+          <w:sz w:val="40"/>
+          <w:szCs w:val="40"/>
+          <w:u w:val="single"/>
         </w:rPr>
       </w:pPr>
       <w:r>
         <w:rPr>
-          <w:lang w:val="en-US"/>
+          <w:b/>
+          <w:sz w:val="40"/>
+          <w:szCs w:val="40"/>
+          <w:u w:val="single"/>
         </w:rPr>
-        <w:t>Josejuviles1</w:t>
+        <w:t>PINTEREST:</w:t>
+      </w:r>
+    </w:p>
+    <w:p>
+      <w:r>
+        <w:t>USARIO: CELAKANTOR (GOOGLE)</w:t>
+      </w:r>
+    </w:p>
+    <w:p>
+      <w:r>
+        <w:t xml:space="preserve">TOKEN: </w:t>
       </w:r>
       <w:r>
         <w:rPr>
-          <w:lang w:val="en-US"/>
+          <w:rFonts w:ascii="Segoe UI" w:hAnsi="Segoe UI" w:cs="Segoe UI"/>
+          <w:color w:val="000000"/>
+          <w:sz w:val="21"/>
+          <w:szCs w:val="21"/>
         </w:rPr>
-        <w:t>@</w:t>
-      </w:r>
-    </w:p>
-    <w:p>
-      <w:pPr>
+        <w:t>pina_AMA4VUAYAD2LUCIAGBAC2D7QZTVU7IIBQBIQCAR43TRQ3LTUCVMVR52MNUAD6TH2CR22G32OR5W6U2QL6PBEAYD73M77ZMAA</w:t>
+      </w:r>
+      <w:bookmarkStart w:id="0" w:name="_GoBack"/>
+      <w:bookmarkEnd w:id="0"/>
+    </w:p>
+    <w:p>
+      <w:r>
         <w:rPr>
-          <w:lang w:val="en-US"/>
+          <w:noProof/>
+          <w:lang w:eastAsia="es-ES"/>
         </w:rPr>
-      </w:pPr>
+        <w:drawing>
+          <wp:inline distT="0" distB="0" distL="0" distR="0" wp14:anchorId="78C59F43" wp14:editId="5AF3E806">
+            <wp:extent cx="5400040" cy="2874645"/>
+            <wp:effectExtent l="0" t="0" r="0" b="1905"/>
+            <wp:docPr id="1" name="Imagen 1"/>
+            <wp:cNvGraphicFramePr>
+              <a:graphicFrameLocks xmlns:a="http://schemas.openxmlformats.org/drawingml/2006/main" noChangeAspect="1"/>
+            </wp:cNvGraphicFramePr>
+            <a:graphic xmlns:a="http://schemas.openxmlformats.org/drawingml/2006/main">
+              <a:graphicData uri="http://schemas.openxmlformats.org/drawingml/2006/picture">
+                <pic:pic xmlns:pic="http://schemas.openxmlformats.org/drawingml/2006/picture">
+                  <pic:nvPicPr>
+                    <pic:cNvPr id="1" name=""/>
+                    <pic:cNvPicPr/>
+                  </pic:nvPicPr>
+                  <pic:blipFill>
+                    <a:blip r:embed="rId8"/>
+                    <a:stretch>
+                      <a:fillRect/>
+                    </a:stretch>
+                  </pic:blipFill>
+                  <pic:spPr>
+                    <a:xfrm>
+                      <a:off x="0" y="0"/>
+                      <a:ext cx="5400040" cy="2874645"/>
+                    </a:xfrm>
+                    <a:prstGeom prst="rect">
+                      <a:avLst/>
+                    </a:prstGeom>
+                  </pic:spPr>
+                </pic:pic>
+              </a:graphicData>
+            </a:graphic>
+          </wp:inline>
+        </w:drawing>
+      </w:r>
     </w:p>
     <w:sectPr>
       <w:pgSz w:w="11906" w:h="16838"/>

</xml_diff>